<commit_message>
Corregido tamaño de imágenes
</commit_message>
<xml_diff>
--- a/build/en_electric_series_parallel_identify.docx
+++ b/build/en_electric_series_parallel_identify.docx
@@ -25,7 +25,7 @@
       <w:r>
         <w:drawing>
           <wp:inline xmlns:a="http://schemas.openxmlformats.org/drawingml/2006/main" xmlns:pic="http://schemas.openxmlformats.org/drawingml/2006/picture">
-            <wp:extent cx="1952542" cy="1900227"/>
+            <wp:extent cx="1464406" cy="1425170"/>
             <wp:docPr id="1" name="Picture 1"/>
             <wp:cNvGraphicFramePr>
               <a:graphicFrameLocks noChangeAspect="1"/>
@@ -46,7 +46,7 @@
                   <pic:spPr>
                     <a:xfrm>
                       <a:off x="0" y="0"/>
-                      <a:ext cx="1952542" cy="1900227"/>
+                      <a:ext cx="1464406" cy="1425170"/>
                     </a:xfrm>
                     <a:prstGeom prst="rect"/>
                   </pic:spPr>
@@ -112,7 +112,7 @@
       <w:r>
         <w:drawing>
           <wp:inline xmlns:a="http://schemas.openxmlformats.org/drawingml/2006/main" xmlns:pic="http://schemas.openxmlformats.org/drawingml/2006/picture">
-            <wp:extent cx="1952542" cy="1900227"/>
+            <wp:extent cx="1464406" cy="1425170"/>
             <wp:docPr id="2" name="Picture 2"/>
             <wp:cNvGraphicFramePr>
               <a:graphicFrameLocks noChangeAspect="1"/>
@@ -133,7 +133,7 @@
                   <pic:spPr>
                     <a:xfrm>
                       <a:off x="0" y="0"/>
-                      <a:ext cx="1952542" cy="1900227"/>
+                      <a:ext cx="1464406" cy="1425170"/>
                     </a:xfrm>
                     <a:prstGeom prst="rect"/>
                   </pic:spPr>
@@ -199,7 +199,7 @@
       <w:r>
         <w:drawing>
           <wp:inline xmlns:a="http://schemas.openxmlformats.org/drawingml/2006/main" xmlns:pic="http://schemas.openxmlformats.org/drawingml/2006/picture">
-            <wp:extent cx="1952542" cy="1900227"/>
+            <wp:extent cx="1464406" cy="1425170"/>
             <wp:docPr id="3" name="Picture 3"/>
             <wp:cNvGraphicFramePr>
               <a:graphicFrameLocks noChangeAspect="1"/>
@@ -220,7 +220,7 @@
                   <pic:spPr>
                     <a:xfrm>
                       <a:off x="0" y="0"/>
-                      <a:ext cx="1952542" cy="1900227"/>
+                      <a:ext cx="1464406" cy="1425170"/>
                     </a:xfrm>
                     <a:prstGeom prst="rect"/>
                   </pic:spPr>
@@ -286,7 +286,7 @@
       <w:r>
         <w:drawing>
           <wp:inline xmlns:a="http://schemas.openxmlformats.org/drawingml/2006/main" xmlns:pic="http://schemas.openxmlformats.org/drawingml/2006/picture">
-            <wp:extent cx="1952542" cy="1830610"/>
+            <wp:extent cx="1464406" cy="1372957"/>
             <wp:docPr id="4" name="Picture 4"/>
             <wp:cNvGraphicFramePr>
               <a:graphicFrameLocks noChangeAspect="1"/>
@@ -307,7 +307,7 @@
                   <pic:spPr>
                     <a:xfrm>
                       <a:off x="0" y="0"/>
-                      <a:ext cx="1952542" cy="1830610"/>
+                      <a:ext cx="1464406" cy="1372957"/>
                     </a:xfrm>
                     <a:prstGeom prst="rect"/>
                   </pic:spPr>
@@ -373,7 +373,7 @@
       <w:r>
         <w:drawing>
           <wp:inline xmlns:a="http://schemas.openxmlformats.org/drawingml/2006/main" xmlns:pic="http://schemas.openxmlformats.org/drawingml/2006/picture">
-            <wp:extent cx="1952542" cy="1900227"/>
+            <wp:extent cx="1464406" cy="1425170"/>
             <wp:docPr id="5" name="Picture 5"/>
             <wp:cNvGraphicFramePr>
               <a:graphicFrameLocks noChangeAspect="1"/>
@@ -394,7 +394,7 @@
                   <pic:spPr>
                     <a:xfrm>
                       <a:off x="0" y="0"/>
-                      <a:ext cx="1952542" cy="1900227"/>
+                      <a:ext cx="1464406" cy="1425170"/>
                     </a:xfrm>
                     <a:prstGeom prst="rect"/>
                   </pic:spPr>
@@ -460,7 +460,7 @@
       <w:r>
         <w:drawing>
           <wp:inline xmlns:a="http://schemas.openxmlformats.org/drawingml/2006/main" xmlns:pic="http://schemas.openxmlformats.org/drawingml/2006/picture">
-            <wp:extent cx="1952542" cy="1900227"/>
+            <wp:extent cx="1464406" cy="1425170"/>
             <wp:docPr id="6" name="Picture 6"/>
             <wp:cNvGraphicFramePr>
               <a:graphicFrameLocks noChangeAspect="1"/>
@@ -481,7 +481,7 @@
                   <pic:spPr>
                     <a:xfrm>
                       <a:off x="0" y="0"/>
-                      <a:ext cx="1952542" cy="1900227"/>
+                      <a:ext cx="1464406" cy="1425170"/>
                     </a:xfrm>
                     <a:prstGeom prst="rect"/>
                   </pic:spPr>
@@ -547,7 +547,7 @@
       <w:r>
         <w:drawing>
           <wp:inline xmlns:a="http://schemas.openxmlformats.org/drawingml/2006/main" xmlns:pic="http://schemas.openxmlformats.org/drawingml/2006/picture">
-            <wp:extent cx="1952542" cy="1900227"/>
+            <wp:extent cx="1464406" cy="1425170"/>
             <wp:docPr id="7" name="Picture 7"/>
             <wp:cNvGraphicFramePr>
               <a:graphicFrameLocks noChangeAspect="1"/>
@@ -568,7 +568,7 @@
                   <pic:spPr>
                     <a:xfrm>
                       <a:off x="0" y="0"/>
-                      <a:ext cx="1952542" cy="1900227"/>
+                      <a:ext cx="1464406" cy="1425170"/>
                     </a:xfrm>
                     <a:prstGeom prst="rect"/>
                   </pic:spPr>
@@ -634,7 +634,7 @@
       <w:r>
         <w:drawing>
           <wp:inline xmlns:a="http://schemas.openxmlformats.org/drawingml/2006/main" xmlns:pic="http://schemas.openxmlformats.org/drawingml/2006/picture">
-            <wp:extent cx="1952542" cy="1830610"/>
+            <wp:extent cx="1464406" cy="1372957"/>
             <wp:docPr id="8" name="Picture 8"/>
             <wp:cNvGraphicFramePr>
               <a:graphicFrameLocks noChangeAspect="1"/>
@@ -655,7 +655,7 @@
                   <pic:spPr>
                     <a:xfrm>
                       <a:off x="0" y="0"/>
-                      <a:ext cx="1952542" cy="1830610"/>
+                      <a:ext cx="1464406" cy="1372957"/>
                     </a:xfrm>
                     <a:prstGeom prst="rect"/>
                   </pic:spPr>
@@ -721,7 +721,7 @@
       <w:r>
         <w:drawing>
           <wp:inline xmlns:a="http://schemas.openxmlformats.org/drawingml/2006/main" xmlns:pic="http://schemas.openxmlformats.org/drawingml/2006/picture">
-            <wp:extent cx="1952542" cy="1900227"/>
+            <wp:extent cx="1464406" cy="1425170"/>
             <wp:docPr id="9" name="Picture 9"/>
             <wp:cNvGraphicFramePr>
               <a:graphicFrameLocks noChangeAspect="1"/>
@@ -742,7 +742,7 @@
                   <pic:spPr>
                     <a:xfrm>
                       <a:off x="0" y="0"/>
-                      <a:ext cx="1952542" cy="1900227"/>
+                      <a:ext cx="1464406" cy="1425170"/>
                     </a:xfrm>
                     <a:prstGeom prst="rect"/>
                   </pic:spPr>
@@ -808,7 +808,7 @@
       <w:r>
         <w:drawing>
           <wp:inline xmlns:a="http://schemas.openxmlformats.org/drawingml/2006/main" xmlns:pic="http://schemas.openxmlformats.org/drawingml/2006/picture">
-            <wp:extent cx="1952542" cy="1900227"/>
+            <wp:extent cx="1464406" cy="1425170"/>
             <wp:docPr id="10" name="Picture 10"/>
             <wp:cNvGraphicFramePr>
               <a:graphicFrameLocks noChangeAspect="1"/>
@@ -829,7 +829,7 @@
                   <pic:spPr>
                     <a:xfrm>
                       <a:off x="0" y="0"/>
-                      <a:ext cx="1952542" cy="1900227"/>
+                      <a:ext cx="1464406" cy="1425170"/>
                     </a:xfrm>
                     <a:prstGeom prst="rect"/>
                   </pic:spPr>
@@ -895,7 +895,7 @@
       <w:r>
         <w:drawing>
           <wp:inline xmlns:a="http://schemas.openxmlformats.org/drawingml/2006/main" xmlns:pic="http://schemas.openxmlformats.org/drawingml/2006/picture">
-            <wp:extent cx="1952542" cy="1900227"/>
+            <wp:extent cx="1464406" cy="1425170"/>
             <wp:docPr id="11" name="Picture 11"/>
             <wp:cNvGraphicFramePr>
               <a:graphicFrameLocks noChangeAspect="1"/>
@@ -916,7 +916,7 @@
                   <pic:spPr>
                     <a:xfrm>
                       <a:off x="0" y="0"/>
-                      <a:ext cx="1952542" cy="1900227"/>
+                      <a:ext cx="1464406" cy="1425170"/>
                     </a:xfrm>
                     <a:prstGeom prst="rect"/>
                   </pic:spPr>
@@ -982,7 +982,7 @@
       <w:r>
         <w:drawing>
           <wp:inline xmlns:a="http://schemas.openxmlformats.org/drawingml/2006/main" xmlns:pic="http://schemas.openxmlformats.org/drawingml/2006/picture">
-            <wp:extent cx="1952542" cy="1830610"/>
+            <wp:extent cx="1464406" cy="1372957"/>
             <wp:docPr id="12" name="Picture 12"/>
             <wp:cNvGraphicFramePr>
               <a:graphicFrameLocks noChangeAspect="1"/>
@@ -1003,7 +1003,7 @@
                   <pic:spPr>
                     <a:xfrm>
                       <a:off x="0" y="0"/>
-                      <a:ext cx="1952542" cy="1830610"/>
+                      <a:ext cx="1464406" cy="1372957"/>
                     </a:xfrm>
                     <a:prstGeom prst="rect"/>
                   </pic:spPr>
@@ -1069,7 +1069,7 @@
       <w:r>
         <w:drawing>
           <wp:inline xmlns:a="http://schemas.openxmlformats.org/drawingml/2006/main" xmlns:pic="http://schemas.openxmlformats.org/drawingml/2006/picture">
-            <wp:extent cx="1952542" cy="1900227"/>
+            <wp:extent cx="1464406" cy="1425170"/>
             <wp:docPr id="13" name="Picture 13"/>
             <wp:cNvGraphicFramePr>
               <a:graphicFrameLocks noChangeAspect="1"/>
@@ -1090,7 +1090,7 @@
                   <pic:spPr>
                     <a:xfrm>
                       <a:off x="0" y="0"/>
-                      <a:ext cx="1952542" cy="1900227"/>
+                      <a:ext cx="1464406" cy="1425170"/>
                     </a:xfrm>
                     <a:prstGeom prst="rect"/>
                   </pic:spPr>
@@ -1156,7 +1156,7 @@
       <w:r>
         <w:drawing>
           <wp:inline xmlns:a="http://schemas.openxmlformats.org/drawingml/2006/main" xmlns:pic="http://schemas.openxmlformats.org/drawingml/2006/picture">
-            <wp:extent cx="1952542" cy="1900227"/>
+            <wp:extent cx="1464406" cy="1425170"/>
             <wp:docPr id="14" name="Picture 14"/>
             <wp:cNvGraphicFramePr>
               <a:graphicFrameLocks noChangeAspect="1"/>
@@ -1177,7 +1177,7 @@
                   <pic:spPr>
                     <a:xfrm>
                       <a:off x="0" y="0"/>
-                      <a:ext cx="1952542" cy="1900227"/>
+                      <a:ext cx="1464406" cy="1425170"/>
                     </a:xfrm>
                     <a:prstGeom prst="rect"/>
                   </pic:spPr>
@@ -1243,7 +1243,7 @@
       <w:r>
         <w:drawing>
           <wp:inline xmlns:a="http://schemas.openxmlformats.org/drawingml/2006/main" xmlns:pic="http://schemas.openxmlformats.org/drawingml/2006/picture">
-            <wp:extent cx="1952542" cy="1900227"/>
+            <wp:extent cx="1464406" cy="1425170"/>
             <wp:docPr id="15" name="Picture 15"/>
             <wp:cNvGraphicFramePr>
               <a:graphicFrameLocks noChangeAspect="1"/>
@@ -1264,7 +1264,7 @@
                   <pic:spPr>
                     <a:xfrm>
                       <a:off x="0" y="0"/>
-                      <a:ext cx="1952542" cy="1900227"/>
+                      <a:ext cx="1464406" cy="1425170"/>
                     </a:xfrm>
                     <a:prstGeom prst="rect"/>
                   </pic:spPr>
@@ -1330,7 +1330,7 @@
       <w:r>
         <w:drawing>
           <wp:inline xmlns:a="http://schemas.openxmlformats.org/drawingml/2006/main" xmlns:pic="http://schemas.openxmlformats.org/drawingml/2006/picture">
-            <wp:extent cx="1952542" cy="1830610"/>
+            <wp:extent cx="1464406" cy="1372957"/>
             <wp:docPr id="16" name="Picture 16"/>
             <wp:cNvGraphicFramePr>
               <a:graphicFrameLocks noChangeAspect="1"/>
@@ -1351,7 +1351,7 @@
                   <pic:spPr>
                     <a:xfrm>
                       <a:off x="0" y="0"/>
-                      <a:ext cx="1952542" cy="1830610"/>
+                      <a:ext cx="1464406" cy="1372957"/>
                     </a:xfrm>
                     <a:prstGeom prst="rect"/>
                   </pic:spPr>
@@ -1417,7 +1417,7 @@
       <w:r>
         <w:drawing>
           <wp:inline xmlns:a="http://schemas.openxmlformats.org/drawingml/2006/main" xmlns:pic="http://schemas.openxmlformats.org/drawingml/2006/picture">
-            <wp:extent cx="1952542" cy="1900227"/>
+            <wp:extent cx="1464406" cy="1425170"/>
             <wp:docPr id="17" name="Picture 17"/>
             <wp:cNvGraphicFramePr>
               <a:graphicFrameLocks noChangeAspect="1"/>
@@ -1438,7 +1438,7 @@
                   <pic:spPr>
                     <a:xfrm>
                       <a:off x="0" y="0"/>
-                      <a:ext cx="1952542" cy="1900227"/>
+                      <a:ext cx="1464406" cy="1425170"/>
                     </a:xfrm>
                     <a:prstGeom prst="rect"/>
                   </pic:spPr>
@@ -1504,7 +1504,7 @@
       <w:r>
         <w:drawing>
           <wp:inline xmlns:a="http://schemas.openxmlformats.org/drawingml/2006/main" xmlns:pic="http://schemas.openxmlformats.org/drawingml/2006/picture">
-            <wp:extent cx="1952542" cy="1900227"/>
+            <wp:extent cx="1464406" cy="1425170"/>
             <wp:docPr id="18" name="Picture 18"/>
             <wp:cNvGraphicFramePr>
               <a:graphicFrameLocks noChangeAspect="1"/>
@@ -1525,7 +1525,7 @@
                   <pic:spPr>
                     <a:xfrm>
                       <a:off x="0" y="0"/>
-                      <a:ext cx="1952542" cy="1900227"/>
+                      <a:ext cx="1464406" cy="1425170"/>
                     </a:xfrm>
                     <a:prstGeom prst="rect"/>
                   </pic:spPr>
@@ -1591,7 +1591,7 @@
       <w:r>
         <w:drawing>
           <wp:inline xmlns:a="http://schemas.openxmlformats.org/drawingml/2006/main" xmlns:pic="http://schemas.openxmlformats.org/drawingml/2006/picture">
-            <wp:extent cx="1952542" cy="1900227"/>
+            <wp:extent cx="1464406" cy="1425170"/>
             <wp:docPr id="19" name="Picture 19"/>
             <wp:cNvGraphicFramePr>
               <a:graphicFrameLocks noChangeAspect="1"/>
@@ -1612,7 +1612,7 @@
                   <pic:spPr>
                     <a:xfrm>
                       <a:off x="0" y="0"/>
-                      <a:ext cx="1952542" cy="1900227"/>
+                      <a:ext cx="1464406" cy="1425170"/>
                     </a:xfrm>
                     <a:prstGeom prst="rect"/>
                   </pic:spPr>
@@ -1678,7 +1678,7 @@
       <w:r>
         <w:drawing>
           <wp:inline xmlns:a="http://schemas.openxmlformats.org/drawingml/2006/main" xmlns:pic="http://schemas.openxmlformats.org/drawingml/2006/picture">
-            <wp:extent cx="1952542" cy="1830610"/>
+            <wp:extent cx="1464406" cy="1372957"/>
             <wp:docPr id="20" name="Picture 20"/>
             <wp:cNvGraphicFramePr>
               <a:graphicFrameLocks noChangeAspect="1"/>
@@ -1699,7 +1699,7 @@
                   <pic:spPr>
                     <a:xfrm>
                       <a:off x="0" y="0"/>
-                      <a:ext cx="1952542" cy="1830610"/>
+                      <a:ext cx="1464406" cy="1372957"/>
                     </a:xfrm>
                     <a:prstGeom prst="rect"/>
                   </pic:spPr>
@@ -1765,7 +1765,7 @@
       <w:r>
         <w:drawing>
           <wp:inline xmlns:a="http://schemas.openxmlformats.org/drawingml/2006/main" xmlns:pic="http://schemas.openxmlformats.org/drawingml/2006/picture">
-            <wp:extent cx="1952542" cy="1900227"/>
+            <wp:extent cx="1464406" cy="1425170"/>
             <wp:docPr id="21" name="Picture 21"/>
             <wp:cNvGraphicFramePr>
               <a:graphicFrameLocks noChangeAspect="1"/>
@@ -1786,7 +1786,7 @@
                   <pic:spPr>
                     <a:xfrm>
                       <a:off x="0" y="0"/>
-                      <a:ext cx="1952542" cy="1900227"/>
+                      <a:ext cx="1464406" cy="1425170"/>
                     </a:xfrm>
                     <a:prstGeom prst="rect"/>
                   </pic:spPr>
@@ -1852,7 +1852,7 @@
       <w:r>
         <w:drawing>
           <wp:inline xmlns:a="http://schemas.openxmlformats.org/drawingml/2006/main" xmlns:pic="http://schemas.openxmlformats.org/drawingml/2006/picture">
-            <wp:extent cx="1952542" cy="1900227"/>
+            <wp:extent cx="1464406" cy="1425170"/>
             <wp:docPr id="22" name="Picture 22"/>
             <wp:cNvGraphicFramePr>
               <a:graphicFrameLocks noChangeAspect="1"/>
@@ -1873,7 +1873,7 @@
                   <pic:spPr>
                     <a:xfrm>
                       <a:off x="0" y="0"/>
-                      <a:ext cx="1952542" cy="1900227"/>
+                      <a:ext cx="1464406" cy="1425170"/>
                     </a:xfrm>
                     <a:prstGeom prst="rect"/>
                   </pic:spPr>
@@ -1939,7 +1939,7 @@
       <w:r>
         <w:drawing>
           <wp:inline xmlns:a="http://schemas.openxmlformats.org/drawingml/2006/main" xmlns:pic="http://schemas.openxmlformats.org/drawingml/2006/picture">
-            <wp:extent cx="1952542" cy="1900227"/>
+            <wp:extent cx="1464406" cy="1425170"/>
             <wp:docPr id="23" name="Picture 23"/>
             <wp:cNvGraphicFramePr>
               <a:graphicFrameLocks noChangeAspect="1"/>
@@ -1960,7 +1960,7 @@
                   <pic:spPr>
                     <a:xfrm>
                       <a:off x="0" y="0"/>
-                      <a:ext cx="1952542" cy="1900227"/>
+                      <a:ext cx="1464406" cy="1425170"/>
                     </a:xfrm>
                     <a:prstGeom prst="rect"/>
                   </pic:spPr>
@@ -2026,7 +2026,7 @@
       <w:r>
         <w:drawing>
           <wp:inline xmlns:a="http://schemas.openxmlformats.org/drawingml/2006/main" xmlns:pic="http://schemas.openxmlformats.org/drawingml/2006/picture">
-            <wp:extent cx="1952542" cy="1830610"/>
+            <wp:extent cx="1464406" cy="1372957"/>
             <wp:docPr id="24" name="Picture 24"/>
             <wp:cNvGraphicFramePr>
               <a:graphicFrameLocks noChangeAspect="1"/>
@@ -2047,7 +2047,7 @@
                   <pic:spPr>
                     <a:xfrm>
                       <a:off x="0" y="0"/>
-                      <a:ext cx="1952542" cy="1830610"/>
+                      <a:ext cx="1464406" cy="1372957"/>
                     </a:xfrm>
                     <a:prstGeom prst="rect"/>
                   </pic:spPr>
@@ -2113,7 +2113,7 @@
       <w:r>
         <w:drawing>
           <wp:inline xmlns:a="http://schemas.openxmlformats.org/drawingml/2006/main" xmlns:pic="http://schemas.openxmlformats.org/drawingml/2006/picture">
-            <wp:extent cx="1952542" cy="1900227"/>
+            <wp:extent cx="1464406" cy="1425170"/>
             <wp:docPr id="25" name="Picture 25"/>
             <wp:cNvGraphicFramePr>
               <a:graphicFrameLocks noChangeAspect="1"/>
@@ -2134,7 +2134,7 @@
                   <pic:spPr>
                     <a:xfrm>
                       <a:off x="0" y="0"/>
-                      <a:ext cx="1952542" cy="1900227"/>
+                      <a:ext cx="1464406" cy="1425170"/>
                     </a:xfrm>
                     <a:prstGeom prst="rect"/>
                   </pic:spPr>
@@ -2200,7 +2200,7 @@
       <w:r>
         <w:drawing>
           <wp:inline xmlns:a="http://schemas.openxmlformats.org/drawingml/2006/main" xmlns:pic="http://schemas.openxmlformats.org/drawingml/2006/picture">
-            <wp:extent cx="1952542" cy="1900227"/>
+            <wp:extent cx="1464406" cy="1425170"/>
             <wp:docPr id="26" name="Picture 26"/>
             <wp:cNvGraphicFramePr>
               <a:graphicFrameLocks noChangeAspect="1"/>
@@ -2221,7 +2221,7 @@
                   <pic:spPr>
                     <a:xfrm>
                       <a:off x="0" y="0"/>
-                      <a:ext cx="1952542" cy="1900227"/>
+                      <a:ext cx="1464406" cy="1425170"/>
                     </a:xfrm>
                     <a:prstGeom prst="rect"/>
                   </pic:spPr>
@@ -2287,7 +2287,7 @@
       <w:r>
         <w:drawing>
           <wp:inline xmlns:a="http://schemas.openxmlformats.org/drawingml/2006/main" xmlns:pic="http://schemas.openxmlformats.org/drawingml/2006/picture">
-            <wp:extent cx="1952542" cy="1900227"/>
+            <wp:extent cx="1464406" cy="1425170"/>
             <wp:docPr id="27" name="Picture 27"/>
             <wp:cNvGraphicFramePr>
               <a:graphicFrameLocks noChangeAspect="1"/>
@@ -2308,7 +2308,7 @@
                   <pic:spPr>
                     <a:xfrm>
                       <a:off x="0" y="0"/>
-                      <a:ext cx="1952542" cy="1900227"/>
+                      <a:ext cx="1464406" cy="1425170"/>
                     </a:xfrm>
                     <a:prstGeom prst="rect"/>
                   </pic:spPr>
@@ -2374,7 +2374,7 @@
       <w:r>
         <w:drawing>
           <wp:inline xmlns:a="http://schemas.openxmlformats.org/drawingml/2006/main" xmlns:pic="http://schemas.openxmlformats.org/drawingml/2006/picture">
-            <wp:extent cx="1952542" cy="1830610"/>
+            <wp:extent cx="1464406" cy="1372957"/>
             <wp:docPr id="28" name="Picture 28"/>
             <wp:cNvGraphicFramePr>
               <a:graphicFrameLocks noChangeAspect="1"/>
@@ -2395,7 +2395,7 @@
                   <pic:spPr>
                     <a:xfrm>
                       <a:off x="0" y="0"/>
-                      <a:ext cx="1952542" cy="1830610"/>
+                      <a:ext cx="1464406" cy="1372957"/>
                     </a:xfrm>
                     <a:prstGeom prst="rect"/>
                   </pic:spPr>
@@ -2461,7 +2461,7 @@
       <w:r>
         <w:drawing>
           <wp:inline xmlns:a="http://schemas.openxmlformats.org/drawingml/2006/main" xmlns:pic="http://schemas.openxmlformats.org/drawingml/2006/picture">
-            <wp:extent cx="1952542" cy="1900227"/>
+            <wp:extent cx="1464406" cy="1425170"/>
             <wp:docPr id="29" name="Picture 29"/>
             <wp:cNvGraphicFramePr>
               <a:graphicFrameLocks noChangeAspect="1"/>
@@ -2482,7 +2482,7 @@
                   <pic:spPr>
                     <a:xfrm>
                       <a:off x="0" y="0"/>
-                      <a:ext cx="1952542" cy="1900227"/>
+                      <a:ext cx="1464406" cy="1425170"/>
                     </a:xfrm>
                     <a:prstGeom prst="rect"/>
                   </pic:spPr>
@@ -2548,7 +2548,7 @@
       <w:r>
         <w:drawing>
           <wp:inline xmlns:a="http://schemas.openxmlformats.org/drawingml/2006/main" xmlns:pic="http://schemas.openxmlformats.org/drawingml/2006/picture">
-            <wp:extent cx="1952542" cy="1900227"/>
+            <wp:extent cx="1464406" cy="1425170"/>
             <wp:docPr id="30" name="Picture 30"/>
             <wp:cNvGraphicFramePr>
               <a:graphicFrameLocks noChangeAspect="1"/>
@@ -2569,7 +2569,7 @@
                   <pic:spPr>
                     <a:xfrm>
                       <a:off x="0" y="0"/>
-                      <a:ext cx="1952542" cy="1900227"/>
+                      <a:ext cx="1464406" cy="1425170"/>
                     </a:xfrm>
                     <a:prstGeom prst="rect"/>
                   </pic:spPr>
@@ -2635,7 +2635,7 @@
       <w:r>
         <w:drawing>
           <wp:inline xmlns:a="http://schemas.openxmlformats.org/drawingml/2006/main" xmlns:pic="http://schemas.openxmlformats.org/drawingml/2006/picture">
-            <wp:extent cx="1952542" cy="1900227"/>
+            <wp:extent cx="1464406" cy="1425170"/>
             <wp:docPr id="31" name="Picture 31"/>
             <wp:cNvGraphicFramePr>
               <a:graphicFrameLocks noChangeAspect="1"/>
@@ -2656,7 +2656,7 @@
                   <pic:spPr>
                     <a:xfrm>
                       <a:off x="0" y="0"/>
-                      <a:ext cx="1952542" cy="1900227"/>
+                      <a:ext cx="1464406" cy="1425170"/>
                     </a:xfrm>
                     <a:prstGeom prst="rect"/>
                   </pic:spPr>
@@ -2722,7 +2722,7 @@
       <w:r>
         <w:drawing>
           <wp:inline xmlns:a="http://schemas.openxmlformats.org/drawingml/2006/main" xmlns:pic="http://schemas.openxmlformats.org/drawingml/2006/picture">
-            <wp:extent cx="1952542" cy="1830610"/>
+            <wp:extent cx="1464406" cy="1372957"/>
             <wp:docPr id="32" name="Picture 32"/>
             <wp:cNvGraphicFramePr>
               <a:graphicFrameLocks noChangeAspect="1"/>
@@ -2743,7 +2743,7 @@
                   <pic:spPr>
                     <a:xfrm>
                       <a:off x="0" y="0"/>
-                      <a:ext cx="1952542" cy="1830610"/>
+                      <a:ext cx="1464406" cy="1372957"/>
                     </a:xfrm>
                     <a:prstGeom prst="rect"/>
                   </pic:spPr>
@@ -2809,7 +2809,7 @@
       <w:r>
         <w:drawing>
           <wp:inline xmlns:a="http://schemas.openxmlformats.org/drawingml/2006/main" xmlns:pic="http://schemas.openxmlformats.org/drawingml/2006/picture">
-            <wp:extent cx="1952542" cy="1900227"/>
+            <wp:extent cx="1464406" cy="1425170"/>
             <wp:docPr id="33" name="Picture 33"/>
             <wp:cNvGraphicFramePr>
               <a:graphicFrameLocks noChangeAspect="1"/>
@@ -2830,7 +2830,7 @@
                   <pic:spPr>
                     <a:xfrm>
                       <a:off x="0" y="0"/>
-                      <a:ext cx="1952542" cy="1900227"/>
+                      <a:ext cx="1464406" cy="1425170"/>
                     </a:xfrm>
                     <a:prstGeom prst="rect"/>
                   </pic:spPr>
@@ -2896,7 +2896,7 @@
       <w:r>
         <w:drawing>
           <wp:inline xmlns:a="http://schemas.openxmlformats.org/drawingml/2006/main" xmlns:pic="http://schemas.openxmlformats.org/drawingml/2006/picture">
-            <wp:extent cx="1952542" cy="1900227"/>
+            <wp:extent cx="1464406" cy="1425170"/>
             <wp:docPr id="34" name="Picture 34"/>
             <wp:cNvGraphicFramePr>
               <a:graphicFrameLocks noChangeAspect="1"/>
@@ -2917,7 +2917,7 @@
                   <pic:spPr>
                     <a:xfrm>
                       <a:off x="0" y="0"/>
-                      <a:ext cx="1952542" cy="1900227"/>
+                      <a:ext cx="1464406" cy="1425170"/>
                     </a:xfrm>
                     <a:prstGeom prst="rect"/>
                   </pic:spPr>
@@ -2983,7 +2983,7 @@
       <w:r>
         <w:drawing>
           <wp:inline xmlns:a="http://schemas.openxmlformats.org/drawingml/2006/main" xmlns:pic="http://schemas.openxmlformats.org/drawingml/2006/picture">
-            <wp:extent cx="1952542" cy="1900227"/>
+            <wp:extent cx="1464406" cy="1425170"/>
             <wp:docPr id="35" name="Picture 35"/>
             <wp:cNvGraphicFramePr>
               <a:graphicFrameLocks noChangeAspect="1"/>
@@ -3004,7 +3004,7 @@
                   <pic:spPr>
                     <a:xfrm>
                       <a:off x="0" y="0"/>
-                      <a:ext cx="1952542" cy="1900227"/>
+                      <a:ext cx="1464406" cy="1425170"/>
                     </a:xfrm>
                     <a:prstGeom prst="rect"/>
                   </pic:spPr>
@@ -3070,7 +3070,7 @@
       <w:r>
         <w:drawing>
           <wp:inline xmlns:a="http://schemas.openxmlformats.org/drawingml/2006/main" xmlns:pic="http://schemas.openxmlformats.org/drawingml/2006/picture">
-            <wp:extent cx="1952542" cy="1830610"/>
+            <wp:extent cx="1464406" cy="1372957"/>
             <wp:docPr id="36" name="Picture 36"/>
             <wp:cNvGraphicFramePr>
               <a:graphicFrameLocks noChangeAspect="1"/>
@@ -3091,7 +3091,7 @@
                   <pic:spPr>
                     <a:xfrm>
                       <a:off x="0" y="0"/>
-                      <a:ext cx="1952542" cy="1830610"/>
+                      <a:ext cx="1464406" cy="1372957"/>
                     </a:xfrm>
                     <a:prstGeom prst="rect"/>
                   </pic:spPr>
@@ -3157,7 +3157,7 @@
       <w:r>
         <w:drawing>
           <wp:inline xmlns:a="http://schemas.openxmlformats.org/drawingml/2006/main" xmlns:pic="http://schemas.openxmlformats.org/drawingml/2006/picture">
-            <wp:extent cx="1952542" cy="1900227"/>
+            <wp:extent cx="1464406" cy="1425170"/>
             <wp:docPr id="37" name="Picture 37"/>
             <wp:cNvGraphicFramePr>
               <a:graphicFrameLocks noChangeAspect="1"/>
@@ -3178,7 +3178,7 @@
                   <pic:spPr>
                     <a:xfrm>
                       <a:off x="0" y="0"/>
-                      <a:ext cx="1952542" cy="1900227"/>
+                      <a:ext cx="1464406" cy="1425170"/>
                     </a:xfrm>
                     <a:prstGeom prst="rect"/>
                   </pic:spPr>
@@ -3244,7 +3244,7 @@
       <w:r>
         <w:drawing>
           <wp:inline xmlns:a="http://schemas.openxmlformats.org/drawingml/2006/main" xmlns:pic="http://schemas.openxmlformats.org/drawingml/2006/picture">
-            <wp:extent cx="1952542" cy="1900227"/>
+            <wp:extent cx="1464406" cy="1425170"/>
             <wp:docPr id="38" name="Picture 38"/>
             <wp:cNvGraphicFramePr>
               <a:graphicFrameLocks noChangeAspect="1"/>
@@ -3265,7 +3265,7 @@
                   <pic:spPr>
                     <a:xfrm>
                       <a:off x="0" y="0"/>
-                      <a:ext cx="1952542" cy="1900227"/>
+                      <a:ext cx="1464406" cy="1425170"/>
                     </a:xfrm>
                     <a:prstGeom prst="rect"/>
                   </pic:spPr>
@@ -3331,7 +3331,7 @@
       <w:r>
         <w:drawing>
           <wp:inline xmlns:a="http://schemas.openxmlformats.org/drawingml/2006/main" xmlns:pic="http://schemas.openxmlformats.org/drawingml/2006/picture">
-            <wp:extent cx="1952542" cy="1900227"/>
+            <wp:extent cx="1464406" cy="1425170"/>
             <wp:docPr id="39" name="Picture 39"/>
             <wp:cNvGraphicFramePr>
               <a:graphicFrameLocks noChangeAspect="1"/>
@@ -3352,7 +3352,7 @@
                   <pic:spPr>
                     <a:xfrm>
                       <a:off x="0" y="0"/>
-                      <a:ext cx="1952542" cy="1900227"/>
+                      <a:ext cx="1464406" cy="1425170"/>
                     </a:xfrm>
                     <a:prstGeom prst="rect"/>
                   </pic:spPr>
@@ -3418,7 +3418,7 @@
       <w:r>
         <w:drawing>
           <wp:inline xmlns:a="http://schemas.openxmlformats.org/drawingml/2006/main" xmlns:pic="http://schemas.openxmlformats.org/drawingml/2006/picture">
-            <wp:extent cx="1952542" cy="1830610"/>
+            <wp:extent cx="1464406" cy="1372957"/>
             <wp:docPr id="40" name="Picture 40"/>
             <wp:cNvGraphicFramePr>
               <a:graphicFrameLocks noChangeAspect="1"/>
@@ -3439,7 +3439,7 @@
                   <pic:spPr>
                     <a:xfrm>
                       <a:off x="0" y="0"/>
-                      <a:ext cx="1952542" cy="1830610"/>
+                      <a:ext cx="1464406" cy="1372957"/>
                     </a:xfrm>
                     <a:prstGeom prst="rect"/>
                   </pic:spPr>

</xml_diff>

<commit_message>
Corregido error en pregunta
</commit_message>
<xml_diff>
--- a/build/en_electric_series_parallel_identify.docx
+++ b/build/en_electric_series_parallel_identify.docx
@@ -2500,7 +2500,7 @@
       <w:r>
         <w:t>a)</w:t>
         <w:tab/>
-        <w:t>In parallel</w:t>
+        <w:t>Short circuit in the battery</w:t>
       </w:r>
     </w:p>
     <w:p>
@@ -2520,7 +2520,7 @@
       <w:r>
         <w:t>c)</w:t>
         <w:tab/>
-        <w:t>Short circuit in the battery</w:t>
+        <w:t>In parallel</w:t>
       </w:r>
     </w:p>
     <w:p>

</xml_diff>